<commit_message>
feat: add WorkCompletionReport & MeterTestingLetter templates, auto-calculate capacity, remove highlights, merge form groups
</commit_message>
<xml_diff>
--- a/templates/Commissioning_Report_TEMPLATE.docx
+++ b/templates/Commissioning_Report_TEMPLATE.docx
@@ -221,7 +221,7 @@
     </w:p>
     <w:p>
       <w:r>
-        <w:t xml:space="preserve"> No. of PV Modules </w:t>
+        <w:t xml:space="preserve"> No. of PV Solar Panel Modules </w:t>
         <w:tab/>
         <w:tab/>
         <w:tab/>
@@ -230,11 +230,11 @@
     </w:p>
     <w:p>
       <w:r>
-        <w:t xml:space="preserve"> Module Capacity(KW) </w:t>
-        <w:tab/>
-        <w:tab/>
-        <w:tab/>
-        <w:t xml:space="preserve">{{ module_capacity_kw }} </w:t>
+        <w:t xml:space="preserve"> Solar Panel Module Capacity (Watt) </w:t>
+        <w:tab/>
+        <w:tab/>
+        <w:tab/>
+        <w:t xml:space="preserve">{{ module_capacity_watt }} </w:t>
       </w:r>
     </w:p>
     <w:p/>

</xml_diff>